<commit_message>
메일 추가 요청(2) — Cummins 분석 시트 Promise Date → 대장 EXW DATE (Undispatched·HCE, 분할 선적 수량 대조, 노란 줄 확인)
- 새 화면 「Cummins EXW」: 분석 시트 자동 선택, Status·구분 거르기(기본 Undispatched·HCE), PO+Part No. 로 대장과 맞춤
- 날짜별 수량(분할 선적), 파일 수량 합 vs PO(초기 발주)·OC 수량 부족·초과 표시, 일치 건만 미리 선택·불일치는 확인 후 반영
- 노란 채우기(SheetJS cellStyles) → 변경 확인 필요, 색 없이도 EXW 바뀜 판정, 반영 전/후 표·엑셀, 대장에 없음/파일에 없음
- 대장에 품번별 출하 일정(exw_plan)·OC 품목 수량(oc_lines) 저장
- 가상 예시(노란 줄·분할·불일치 포함 xlsx), 시험 79 → 87개, 기획서 11.5

Co-Authored-By: Claude Opus 5.5 <noreply@anthropic.com>
</commit_message>
<xml_diff>
--- a/docs/01_프로젝트_기획서.docx
+++ b/docs/01_프로젝트_기획서.docx
@@ -197,7 +197,7 @@
           <w:p>
             <w:r/>
             <w:r>
-              <w:t>초안 v0.3 — 2026-09-29 메일 추가 자료(항차 매뉴얼·실물 PO·OC 회신·Cummins 주간 현황) 반영</w:t>
+              <w:t>초안 v0.3 — 2026-09-29 메일 추가 자료(항차 매뉴얼·실물 PO·OC 회신·Cummins 주간 현황)와 추가 요청(2: Cummins Promise Date → EXW DATE) 반영</w:t>
             </w:r>
           </w:p>
         </w:tc>
@@ -3801,6 +3801,373 @@
     </w:p>
     <w:p>
       <w:pPr>
+        <w:pStyle w:val="Heading2"/>
+      </w:pPr>
+      <w:r>
+        <w:t>11.5 2026-09-29 메일 추가 요청(2) — Cummins Promise Date → EXW DATE</w:t>
+      </w:r>
+    </w:p>
+    <w:p>
+      <w:r>
+        <w:rPr>
+          <w:b/>
+        </w:rPr>
+        <w:t>원문</w:t>
+      </w:r>
+      <w:r>
+        <w:t>(</w:t>
+      </w:r>
+      <w:r>
+        <w:rPr>
+          <w:rFonts w:ascii="Consolas" w:hAnsi="Consolas"/>
+        </w:rPr>
+        <w:t>docs/source/2026-09-29_메일_추가자료.md</w:t>
+      </w:r>
+      <w:r>
+        <w:t xml:space="preserve"> 끝): 「첨부 파일에서 promise date를 exw date에 입력 / 필터링 Status : undispatched / 구분 : HCE / 노란컬럼은 EXW DATE 변경된 건이므로 확인 요망 / 해당 PO 및 Part NO(자재번호) 수량에 맞게 입력 (초기 발주수량으로 OC 전달받은 EXW DATE(출하 일정)와 변경 출하일별 선적 수량이 달라 일치가 안되는 경우 있으므로 체크 필요)」. 기준 시트는 「wk38 분석E」입니다.</w:t>
+      </w:r>
+    </w:p>
+    <w:p>
+      <w:r>
+        <w:rPr>
+          <w:b/>
+        </w:rPr>
+        <w:t>반영 방식 — 새 화면 「Cummins EXW」</w:t>
+      </w:r>
+    </w:p>
+    <w:tbl>
+      <w:tblPr>
+        <w:tblStyle w:val="TableGrid"/>
+        <w:tblW w:type="auto" w:w="0"/>
+        <w:tblLook w:firstColumn="1" w:firstRow="1" w:lastColumn="0" w:lastRow="0" w:noHBand="0" w:noVBand="1" w:val="04A0"/>
+      </w:tblPr>
+      <w:tblGrid>
+        <w:gridCol w:w="4320"/>
+        <w:gridCol w:w="4320"/>
+      </w:tblGrid>
+      <w:tr>
+        <w:tc>
+          <w:tcPr>
+            <w:tcW w:type="dxa" w:w="4320"/>
+          </w:tcPr>
+          <w:p>
+            <w:r>
+              <w:rPr>
+                <w:b/>
+              </w:rPr>
+            </w:r>
+            <w:r>
+              <w:rPr>
+                <w:b/>
+              </w:rPr>
+              <w:t>요청</w:t>
+            </w:r>
+          </w:p>
+        </w:tc>
+        <w:tc>
+          <w:tcPr>
+            <w:tcW w:type="dxa" w:w="4320"/>
+          </w:tcPr>
+          <w:p>
+            <w:r>
+              <w:rPr>
+                <w:b/>
+              </w:rPr>
+            </w:r>
+            <w:r>
+              <w:rPr>
+                <w:b/>
+              </w:rPr>
+              <w:t>도구</w:t>
+            </w:r>
+          </w:p>
+        </w:tc>
+      </w:tr>
+      <w:tr>
+        <w:tc>
+          <w:tcPr>
+            <w:tcW w:type="dxa" w:w="4320"/>
+          </w:tcPr>
+          <w:p>
+            <w:r/>
+            <w:r>
+              <w:t>시트</w:t>
+            </w:r>
+          </w:p>
+        </w:tc>
+        <w:tc>
+          <w:tcPr>
+            <w:tcW w:type="dxa" w:w="4320"/>
+          </w:tcPr>
+          <w:p>
+            <w:r/>
+            <w:r>
+              <w:t>파일을 올리면 이름에 「분석」이 든 시트를 먼저 고르고(없으면 wk 시트), 화면에서 바꿀 수 있습니다. 머리글 행(2행)은 자동으로 찾습니다</w:t>
+            </w:r>
+          </w:p>
+        </w:tc>
+      </w:tr>
+      <w:tr>
+        <w:tc>
+          <w:tcPr>
+            <w:tcW w:type="dxa" w:w="4320"/>
+          </w:tcPr>
+          <w:p>
+            <w:r/>
+            <w:r>
+              <w:t>거르기</w:t>
+            </w:r>
+          </w:p>
+        </w:tc>
+        <w:tc>
+          <w:tcPr>
+            <w:tcW w:type="dxa" w:w="4320"/>
+          </w:tcPr>
+          <w:p>
+            <w:r/>
+            <w:r>
+              <w:t>Status = Undispatched, 구분 = HCE 가 기본값. 대소문자·공백 무시, 비우면 전체. 파일에 있는 값 목록을 고를 수 있게 둠</w:t>
+            </w:r>
+          </w:p>
+        </w:tc>
+      </w:tr>
+      <w:tr>
+        <w:tc>
+          <w:tcPr>
+            <w:tcW w:type="dxa" w:w="4320"/>
+          </w:tcPr>
+          <w:p>
+            <w:r/>
+            <w:r>
+              <w:t>Promise Date → EXW DATE</w:t>
+            </w:r>
+          </w:p>
+        </w:tc>
+        <w:tc>
+          <w:tcPr>
+            <w:tcW w:type="dxa" w:w="4320"/>
+          </w:tcPr>
+          <w:p>
+            <w:r/>
+            <w:r>
+              <w:t xml:space="preserve">Customer PO + Part No. 로 대장 PO(와 PO 품목 줄)를 맞춥니다. 반영하면 PO에 </w:t>
+            </w:r>
+            <w:r>
+              <w:rPr>
+                <w:b/>
+              </w:rPr>
+              <w:t>품번별 출하 일정(날짜 × 수량)</w:t>
+            </w:r>
+            <w:r>
+              <w:t xml:space="preserve"> 을 저장하고, 대장의 약속 EXW DATE는 그 PO의 가장 이른 날짜로 둡니다. 날짜는 엑셀 일련번호·날짜·글자(11/2/2026) 모두 읽습니다</w:t>
+            </w:r>
+          </w:p>
+        </w:tc>
+      </w:tr>
+      <w:tr>
+        <w:tc>
+          <w:tcPr>
+            <w:tcW w:type="dxa" w:w="4320"/>
+          </w:tcPr>
+          <w:p>
+            <w:r/>
+            <w:r>
+              <w:t>분할 선적·수량 체크</w:t>
+            </w:r>
+          </w:p>
+        </w:tc>
+        <w:tc>
+          <w:tcPr>
+            <w:tcW w:type="dxa" w:w="4320"/>
+          </w:tcPr>
+          <w:p>
+            <w:r/>
+            <w:r>
+              <w:t xml:space="preserve">같은 PO·품번에 날짜가 여러 개면 날짜별 수량으로 나눠 보여 줍니다. 파일의 수량 합(같은 구분 안에서 이미 출고된 줄 포함, 취소 제외)을 대장의 </w:t>
+            </w:r>
+            <w:r>
+              <w:rPr>
+                <w:b/>
+              </w:rPr>
+              <w:t>PO 수량(초기 발주)</w:t>
+            </w:r>
+            <w:r>
+              <w:t xml:space="preserve"> 과 </w:t>
+            </w:r>
+            <w:r>
+              <w:rPr>
+                <w:b/>
+              </w:rPr>
+              <w:t>OC 수량</w:t>
+            </w:r>
+            <w:r>
+              <w:t>(OC 엑셀 반영 때 저장)에 대조해 부족·초과를 표시합니다</w:t>
+            </w:r>
+          </w:p>
+        </w:tc>
+      </w:tr>
+      <w:tr>
+        <w:tc>
+          <w:tcPr>
+            <w:tcW w:type="dxa" w:w="4320"/>
+          </w:tcPr>
+          <w:p>
+            <w:r/>
+            <w:r>
+              <w:t>반영 규칙</w:t>
+            </w:r>
+          </w:p>
+        </w:tc>
+        <w:tc>
+          <w:tcPr>
+            <w:tcW w:type="dxa" w:w="4320"/>
+          </w:tcPr>
+          <w:p>
+            <w:r/>
+            <w:r>
+              <w:t>수량이 맞는 묶음만 처음부터 골라 두고(일괄 반영), 불일치·수량 모름은 사람이 확인한 뒤 골라야 반영됩니다. 반영 전/후 EXW 비교 표와 엑셀 내보내기(대장 PO·대장에 없음·파일에 없음·반영 전후 4개 시트)</w:t>
+            </w:r>
+          </w:p>
+        </w:tc>
+      </w:tr>
+      <w:tr>
+        <w:tc>
+          <w:tcPr>
+            <w:tcW w:type="dxa" w:w="4320"/>
+          </w:tcPr>
+          <w:p>
+            <w:r/>
+            <w:r>
+              <w:t>노란 줄</w:t>
+            </w:r>
+          </w:p>
+        </w:tc>
+        <w:tc>
+          <w:tcPr>
+            <w:tcW w:type="dxa" w:w="4320"/>
+          </w:tcPr>
+          <w:p>
+            <w:r/>
+            <w:r>
+              <w:t>셀 채우기 색(노랑)을 읽어 「변경 확인 필요」로 강조합니다. 색과 별도로, 지금 대장의 EXW와 다른 묶음은 「EXW 바뀜」으로 표시합니다(색이 없는 파일이어도 판정됨)</w:t>
+            </w:r>
+          </w:p>
+        </w:tc>
+      </w:tr>
+      <w:tr>
+        <w:tc>
+          <w:tcPr>
+            <w:tcW w:type="dxa" w:w="4320"/>
+          </w:tcPr>
+          <w:p>
+            <w:r/>
+            <w:r>
+              <w:t>대장과 안 맞는 것</w:t>
+            </w:r>
+          </w:p>
+        </w:tc>
+        <w:tc>
+          <w:tcPr>
+            <w:tcW w:type="dxa" w:w="4320"/>
+          </w:tcPr>
+          <w:p>
+            <w:r/>
+            <w:r>
+              <w:t>「대장에 없는 PO·품번」, 「대장(같은 업체, 출고 전)에는 있으나 거른 결과에 없는 PO·품번」(파일에 다른 Status로 있으면 그 값) 목록</w:t>
+            </w:r>
+          </w:p>
+        </w:tc>
+      </w:tr>
+    </w:tbl>
+    <w:p>
+      <w:r>
+        <w:rPr>
+          <w:b/>
+        </w:rPr>
+        <w:t>실물로 확인한 결과(리포 밖에서 확인, 값은 옮기지 않음)</w:t>
+      </w:r>
+    </w:p>
+    <w:p>
+      <w:pPr>
+        <w:pStyle w:val="ListBullet"/>
+      </w:pPr>
+      <w:r>
+        <w:t xml:space="preserve">노란 줄: openpyxl로 센 노란 채우기 줄은 3행부터 31줄(자료 30줄 + 표 아래 통계 줄 1줄)입니다. 도구(SheetJS </w:t>
+      </w:r>
+      <w:r>
+        <w:rPr>
+          <w:rFonts w:ascii="Consolas" w:hAnsi="Consolas"/>
+        </w:rPr>
+        <w:t>cellStyles</w:t>
+      </w:r>
+      <w:r>
+        <w:t>)도 같은 줄을 잡았습니다(화면 표시는 머리글 쪽 1줄을 더해 32줄). 자료 줄로 좁히면 두 방법 모두 30줄입니다. SheetJS 무료판이 셀 채우기 색을 읽는 것을 실물로 확인했습니다.</w:t>
+      </w:r>
+    </w:p>
+    <w:p>
+      <w:pPr>
+        <w:pStyle w:val="ListBullet"/>
+      </w:pPr>
+      <w:r>
+        <w:t>거르기(Undispatched · HCE): 194줄, PO·품번 180묶음, 그 가운데 날짜가 둘 이상으로 나뉜 묶음 4건, 노란 줄 4줄. 노란 30줄 대부분은 이미 Dispatched이거나 구분이 HDX라 거른 결과에서는 빠집니다.</w:t>
+      </w:r>
+    </w:p>
+    <w:p>
+      <w:pPr>
+        <w:pStyle w:val="ListBullet"/>
+      </w:pPr>
+      <w:r>
+        <w:t>지금 대장에는 이 PO들이 없어 모두 「대장에 없는 PO」로 나옵니다. 가상의 대장으로 수량 일치·불일치·수량 모름 판정과 반영을 확인했습니다.</w:t>
+      </w:r>
+    </w:p>
+    <w:p>
+      <w:r>
+        <w:rPr>
+          <w:b/>
+        </w:rPr>
+        <w:t>남은 확인 사항</w:t>
+      </w:r>
+    </w:p>
+    <w:p>
+      <w:pPr>
+        <w:pStyle w:val="ListNumber"/>
+      </w:pPr>
+      <w:r>
+        <w:rPr>
+          <w:b/>
+        </w:rPr>
+        <w:t>Status가 수식입니다.</w:t>
+      </w:r>
+      <w:r>
+        <w:t xml:space="preserve"> 파일을 저장한 날 기준으로 Undispatched/Abnormal이 갈려, 오늘 열면 값이 바뀔 수 있습니다. Promise Date가 지났는데 출고되지 않은 Abnormal 줄도 EXW 입력 대상인지 확인해 주십시오.</w:t>
+      </w:r>
+    </w:p>
+    <w:p>
+      <w:pPr>
+        <w:pStyle w:val="ListNumber"/>
+      </w:pPr>
+      <w:r>
+        <w:t>수량 대조 기준 — 파일 수량 합에 이미 출고된(Dispatched) 줄을 포함했습니다. 남은(Undispatched) 수량만 PO 잔량과 비교하는 편이 맞는지.</w:t>
+      </w:r>
+    </w:p>
+    <w:p>
+      <w:pPr>
+        <w:pStyle w:val="ListNumber"/>
+      </w:pPr>
+      <w:r>
+        <w:t>한 PO에 품번이 여러 개이거나 날짜가 나뉠 때 SRM EXW DATE에 넣는 값 — 도구는 가장 이른 날을 대표로 두고 품번별 일정을 따로 저장합니다. 실제로는 분할 건마다 입력하는지.</w:t>
+      </w:r>
+    </w:p>
+    <w:p>
+      <w:pPr>
+        <w:pStyle w:val="ListNumber"/>
+      </w:pPr>
+      <w:r>
+        <w:t>노란 줄 표시는 누가 언제 칠하는지(전주 대비 변경을 수기로 표시하는지). 색 대신 전주 파일과 비교해도 되는지(「Promise Date」 화면의 두 주차 비교).</w:t>
+      </w:r>
+    </w:p>
+    <w:p>
+      <w:pPr>
         <w:pStyle w:val="Heading1"/>
       </w:pPr>
       <w:r>
@@ -4091,6 +4458,47 @@
             <w:r/>
             <w:r>
               <w:t>Packing List 자재 합중량과 B/L 중량 일치 확인</w:t>
+            </w:r>
+          </w:p>
+        </w:tc>
+      </w:tr>
+      <w:tr>
+        <w:tc>
+          <w:tcPr>
+            <w:tcW w:type="dxa" w:w="2880"/>
+          </w:tcPr>
+          <w:p>
+            <w:r/>
+            <w:r>
+              <w:t>메일 (2026-09-29 오전 11시대)</w:t>
+            </w:r>
+          </w:p>
+        </w:tc>
+        <w:tc>
+          <w:tcPr>
+            <w:tcW w:type="dxa" w:w="2880"/>
+          </w:tcPr>
+          <w:p>
+            <w:r/>
+            <w:r>
+              <w:rPr>
+                <w:rFonts w:ascii="Consolas" w:hAnsi="Consolas"/>
+              </w:rPr>
+              <w:t>2026-09-29_메일_추가자료.md</w:t>
+            </w:r>
+            <w:r>
+              <w:t xml:space="preserve"> 끝</w:t>
+            </w:r>
+          </w:p>
+        </w:tc>
+        <w:tc>
+          <w:tcPr>
+            <w:tcW w:type="dxa" w:w="2880"/>
+          </w:tcPr>
+          <w:p>
+            <w:r/>
+            <w:r>
+              <w:t>「wk38 분석E」 시트의 Promise Date를 EXW DATE로(Undispatched·HCE, 노란 줄 확인, 분할 선적 수량 체크)</w:t>
             </w:r>
           </w:p>
         </w:tc>

</xml_diff>